<commit_message>
Payment Terms: map Net 75/90/120 (live in prod picklist, unmapped = policy bypass)
Prod picklist offers Net 75/90/120 (0 uses in 730 days) contrary to the
pack's stops-at-Net-60 claim; unmapped they resolved to 0 days and slipped
past the block, justification gate and chain. Days formula extended, KJDEV
picklist aligned to prod, Net 90 verified end-to-end; retire-or-keep
decision put to Lina in the playback doc.

Co-Authored-By: Claude Fable 5 <noreply@anthropic.com>
</commit_message>
<xml_diff>
--- a/docs/payment-terms/Payment_Terms_Logic_Playback_Lina.docx
+++ b/docs/payment-terms/Payment_Terms_Logic_Playback_Lina.docx
@@ -402,7 +402,7 @@
                 <w:sz w:val="20"/>
                 <w:szCs w:val="20"/>
               </w:rPr>
-              <w:t xml:space="preserve">Anything beyond 60 days</w:t>
+              <w:t xml:space="preserve">Net 75 / Net 90 / Net 120</w:t>
             </w:r>
           </w:p>
         </w:tc>
@@ -425,7 +425,7 @@
                 <w:sz w:val="20"/>
                 <w:szCs w:val="20"/>
               </w:rPr>
-              <w:t xml:space="preserve">Not possible — the terms list stops at Net 60.</w:t>
+              <w:t xml:space="preserve">These values exist in the production terms list (unused for at least two years). They are policed by exactly the same rules and chain as Net 45/60, pending your decision to retire them or keep them — see section 5.</w:t>
             </w:r>
           </w:p>
         </w:tc>
@@ -448,7 +448,7 @@
                 <w:sz w:val="20"/>
                 <w:szCs w:val="20"/>
               </w:rPr>
-              <w:t xml:space="preserve">60 days absolute maximum.</w:t>
+              <w:t xml:space="preserve">60 days absolute maximum — decision needed.</w:t>
             </w:r>
           </w:p>
         </w:tc>
@@ -849,14 +849,14 @@
           <w:sz w:val="21"/>
           <w:szCs w:val="21"/>
         </w:rPr>
-        <w:t xml:space="preserve">60 vs 120 days — </w:t>
-      </w:r>
-      <w:r>
-        <w:rPr>
-          <w:sz w:val="21"/>
-          <w:szCs w:val="21"/>
-        </w:rPr>
-        <w:t xml:space="preserve">The build enforces 60 days as the absolute maximum, per the guardrail in the process document. The 120-day row in its approvals table is treated as superseded — the document should be corrected either way before cascade.</w:t>
+        <w:t xml:space="preserve">60 vs 120 days — decision needed — </w:t>
+      </w:r>
+      <w:r>
+        <w:rPr>
+          <w:sz w:val="21"/>
+          <w:szCs w:val="21"/>
+        </w:rPr>
+        <w:t xml:space="preserve">The production terms list turns out to offer Net 75, Net 90 and Net 120 — contrary to the earlier assumption that it stopped at Net 60. No quote has used any of them in at least two years, and all three are now policed by the same rules and approval chain as Net 45/60. Decision needed: (a) deactivate the three values at go-live for a true 60-day hard cap — zero operational impact, matches the guardrail — or (b) keep them available behind the chain, matching the process document’s 120-days-in-rare-cases row. The document should be corrected to whichever is chosen before cascade.</w:t>
       </w:r>
     </w:p>
     <w:p>

</xml_diff>

<commit_message>
Payment Terms: record decision - Net 75/90/120 kept behind the chain
Co-Authored-By: Claude Fable 5 <noreply@anthropic.com>
</commit_message>
<xml_diff>
--- a/docs/payment-terms/Payment_Terms_Logic_Playback_Lina.docx
+++ b/docs/payment-terms/Payment_Terms_Logic_Playback_Lina.docx
@@ -425,7 +425,7 @@
                 <w:sz w:val="20"/>
                 <w:szCs w:val="20"/>
               </w:rPr>
-              <w:t xml:space="preserve">These values exist in the production terms list (unused for at least two years). They are policed by exactly the same rules and chain as Net 45/60, pending your decision to retire them or keep them — see section 5.</w:t>
+              <w:t xml:space="preserve">Kept available for the extremely rare cases the process document allows (unused for at least two years). Policed by exactly the same rules and two-step chain as Net 45/60.</w:t>
             </w:r>
           </w:p>
         </w:tc>
@@ -448,7 +448,7 @@
                 <w:sz w:val="20"/>
                 <w:szCs w:val="20"/>
               </w:rPr>
-              <w:t xml:space="preserve">60 days absolute maximum — decision needed.</w:t>
+              <w:t xml:space="preserve">Above 60 days only in extremely rare circumstances, with Finance approval.</w:t>
             </w:r>
           </w:p>
         </w:tc>
@@ -849,14 +849,14 @@
           <w:sz w:val="21"/>
           <w:szCs w:val="21"/>
         </w:rPr>
-        <w:t xml:space="preserve">60 vs 120 days — decision needed — </w:t>
-      </w:r>
-      <w:r>
-        <w:rPr>
-          <w:sz w:val="21"/>
-          <w:szCs w:val="21"/>
-        </w:rPr>
-        <w:t xml:space="preserve">The production terms list turns out to offer Net 75, Net 90 and Net 120 — contrary to the earlier assumption that it stopped at Net 60. No quote has used any of them in at least two years, and all three are now policed by the same rules and approval chain as Net 45/60. Decision needed: (a) deactivate the three values at go-live for a true 60-day hard cap — zero operational impact, matches the guardrail — or (b) keep them available behind the chain, matching the process document’s 120-days-in-rare-cases row. The document should be corrected to whichever is chosen before cascade.</w:t>
+        <w:t xml:space="preserve">60 vs 120 days — decided — </w:t>
+      </w:r>
+      <w:r>
+        <w:rPr>
+          <w:sz w:val="21"/>
+          <w:szCs w:val="21"/>
+        </w:rPr>
+        <w:t xml:space="preserve">Decided: Net 75, Net 90 and Net 120 remain available for the extremely rare cases the process document’s approvals table allows (none has been used in at least two years), policed by the same rules and two-step chain as Net 45/60. One correction for the document before cascade: soften the “60 days is the absolute maximum” guardrail line to match the approvals table — above 60 days is possible in extremely rare circumstances, with Finance approval.</w:t>
       </w:r>
     </w:p>
     <w:p>

</xml_diff>

<commit_message>
Payment Terms: Nick F scope confirmation recorded - prod unblocked
Co-Authored-By: Claude Fable 5 <noreply@anthropic.com>
</commit_message>
<xml_diff>
--- a/docs/payment-terms/Payment_Terms_Logic_Playback_Lina.docx
+++ b/docs/payment-terms/Payment_Terms_Logic_Playback_Lina.docx
@@ -875,14 +875,14 @@
           <w:sz w:val="21"/>
           <w:szCs w:val="21"/>
         </w:rPr>
-        <w:t xml:space="preserve">Scope — </w:t>
-      </w:r>
-      <w:r>
-        <w:rPr>
-          <w:sz w:val="21"/>
-          <w:szCs w:val="21"/>
-        </w:rPr>
-        <w:t xml:space="preserve">Scope is all contracts including ALM (Ken’s recommendation); production activation follows Nick F’s confirmation.</w:t>
+        <w:t xml:space="preserve">Scope — confirmed — </w:t>
+      </w:r>
+      <w:r>
+        <w:rPr>
+          <w:sz w:val="21"/>
+          <w:szCs w:val="21"/>
+        </w:rPr>
+        <w:t xml:space="preserve">Confirmed by Nick F (29 August): one unified process for all contracts including ALM, per Ken’s recommendation. Production activation is cleared to proceed.</w:t>
       </w:r>
     </w:p>
     <w:p>

</xml_diff>